<commit_message>
Expand market research full pack workflow
</commit_message>
<xml_diff>
--- a/docs/Market_Research_Gold_Standard_Guide.docx
+++ b/docs/Market_Research_Gold_Standard_Guide.docx
@@ -26,7 +26,7 @@
           <w:color w:val="000000"/>
           <w:sz w:val="20"/>
         </w:rPr>
-        <w:t>How to create the most thorough Pattern market research document | June 2026</w:t>
+        <w:t>How to create the most thorough objective market research document | June 2026</w:t>
       </w:r>
     </w:p>
     <w:tbl>
@@ -132,7 +132,7 @@
           <w:rFonts w:ascii="Wix Madefor Display" w:hAnsi="Wix Madefor Display" w:eastAsia="Wix Madefor Display"/>
           <w:sz w:val="18"/>
         </w:rPr>
-        <w:t>Separate facts, estimates, hypotheses, vendor claims, and Pattern analytics.</w:t>
+        <w:t>Separate facts, estimates, hypotheses, vendor claims, management claims, and internal/client analytics.</w:t>
       </w:r>
     </w:p>
     <w:p>
@@ -1073,6 +1073,785 @@
           <w:color w:val="4280F4"/>
           <w:sz w:val="24"/>
         </w:rPr>
+        <w:t>Full Market Pack Module Spine</w:t>
+      </w:r>
+    </w:p>
+    <w:p>
+      <w:pPr>
+        <w:spacing w:after="120" w:line="252" w:lineRule="auto"/>
+      </w:pPr>
+      <w:r>
+        <w:rPr>
+          <w:rFonts w:ascii="Wix Madefor Display" w:hAnsi="Wix Madefor Display" w:eastAsia="Wix Madefor Display"/>
+          <w:color w:val="000000"/>
+          <w:sz w:val="18"/>
+        </w:rPr>
+        <w:t>For the most comprehensive market pack, preserve the analytical jobs from the Commerce Market Research Pack source modules while keeping the output objective and specific to the evaluated company, market, asset, operator, or investor.</w:t>
+      </w:r>
+    </w:p>
+    <w:tbl>
+      <w:tblPr>
+        <w:tblW w:type="auto" w:w="0"/>
+        <w:jc w:val="center"/>
+        <w:tblLook w:firstColumn="1" w:firstRow="1" w:lastColumn="0" w:lastRow="0" w:noHBand="0" w:noVBand="1" w:val="04A0"/>
+      </w:tblPr>
+      <w:tblGrid>
+        <w:gridCol w:w="5400"/>
+        <w:gridCol w:w="5400"/>
+      </w:tblGrid>
+      <w:tr>
+        <w:trPr>
+          <w:tblHeader w:val="true"/>
+        </w:trPr>
+        <w:tc>
+          <w:tcPr>
+            <w:tcW w:type="dxa" w:w="3300"/>
+            <w:shd w:fill="0F4761"/>
+            <w:tcBorders>
+              <w:top w:val="single" w:sz="4" w:space="0" w:color="DDDDDD"/>
+              <w:left w:val="single" w:sz="4" w:space="0" w:color="DDDDDD"/>
+              <w:bottom w:val="single" w:sz="4" w:space="0" w:color="DDDDDD"/>
+              <w:right w:val="single" w:sz="4" w:space="0" w:color="DDDDDD"/>
+            </w:tcBorders>
+            <w:tcMar>
+              <w:top w:w="80" w:type="dxa"/>
+              <w:left w:w="120" w:type="dxa"/>
+              <w:bottom w:w="80" w:type="dxa"/>
+              <w:right w:w="120" w:type="dxa"/>
+            </w:tcMar>
+          </w:tcPr>
+          <w:p>
+            <w:pPr>
+              <w:spacing w:after="0"/>
+            </w:pPr>
+            <w:r>
+              <w:rPr>
+                <w:rFonts w:ascii="Wix Madefor Display SemiBold" w:hAnsi="Wix Madefor Display SemiBold" w:eastAsia="Wix Madefor Display SemiBold"/>
+                <w:b/>
+                <w:color w:val="FFFFFF"/>
+                <w:sz w:val="16"/>
+              </w:rPr>
+              <w:t>Module</w:t>
+            </w:r>
+          </w:p>
+        </w:tc>
+        <w:tc>
+          <w:tcPr>
+            <w:tcW w:type="dxa" w:w="7500"/>
+            <w:shd w:fill="0F4761"/>
+            <w:tcBorders>
+              <w:top w:val="single" w:sz="4" w:space="0" w:color="DDDDDD"/>
+              <w:left w:val="single" w:sz="4" w:space="0" w:color="DDDDDD"/>
+              <w:bottom w:val="single" w:sz="4" w:space="0" w:color="DDDDDD"/>
+              <w:right w:val="single" w:sz="4" w:space="0" w:color="DDDDDD"/>
+            </w:tcBorders>
+            <w:tcMar>
+              <w:top w:w="80" w:type="dxa"/>
+              <w:left w:w="120" w:type="dxa"/>
+              <w:bottom w:w="80" w:type="dxa"/>
+              <w:right w:w="120" w:type="dxa"/>
+            </w:tcMar>
+          </w:tcPr>
+          <w:p>
+            <w:pPr>
+              <w:spacing w:after="0"/>
+            </w:pPr>
+            <w:r>
+              <w:rPr>
+                <w:rFonts w:ascii="Wix Madefor Display SemiBold" w:hAnsi="Wix Madefor Display SemiBold" w:eastAsia="Wix Madefor Display SemiBold"/>
+                <w:b/>
+                <w:color w:val="FFFFFF"/>
+                <w:sz w:val="16"/>
+              </w:rPr>
+              <w:t>Minimum standard</w:t>
+            </w:r>
+          </w:p>
+        </w:tc>
+      </w:tr>
+      <w:tr>
+        <w:tc>
+          <w:tcPr>
+            <w:tcW w:type="dxa" w:w="3300"/>
+            <w:tcBorders>
+              <w:top w:val="single" w:sz="4" w:space="0" w:color="DDDDDD"/>
+              <w:left w:val="single" w:sz="4" w:space="0" w:color="DDDDDD"/>
+              <w:bottom w:val="single" w:sz="4" w:space="0" w:color="DDDDDD"/>
+              <w:right w:val="single" w:sz="4" w:space="0" w:color="DDDDDD"/>
+            </w:tcBorders>
+            <w:tcMar>
+              <w:top w:w="80" w:type="dxa"/>
+              <w:left w:w="120" w:type="dxa"/>
+              <w:bottom w:w="80" w:type="dxa"/>
+              <w:right w:w="120" w:type="dxa"/>
+            </w:tcMar>
+            <w:shd w:fill="F5F8FF"/>
+            <w:vAlign w:val="center"/>
+          </w:tcPr>
+          <w:p>
+            <w:pPr>
+              <w:spacing w:after="0"/>
+            </w:pPr>
+            <w:r>
+              <w:rPr>
+                <w:rFonts w:ascii="Wix Madefor Display" w:hAnsi="Wix Madefor Display" w:eastAsia="Wix Madefor Display"/>
+                <w:b w:val="0"/>
+                <w:color w:val="000000"/>
+                <w:sz w:val="16"/>
+              </w:rPr>
+              <w:t>TAM and sizing</w:t>
+            </w:r>
+          </w:p>
+        </w:tc>
+        <w:tc>
+          <w:tcPr>
+            <w:tcW w:type="dxa" w:w="7500"/>
+            <w:tcBorders>
+              <w:top w:val="single" w:sz="4" w:space="0" w:color="DDDDDD"/>
+              <w:left w:val="single" w:sz="4" w:space="0" w:color="DDDDDD"/>
+              <w:bottom w:val="single" w:sz="4" w:space="0" w:color="DDDDDD"/>
+              <w:right w:val="single" w:sz="4" w:space="0" w:color="DDDDDD"/>
+            </w:tcBorders>
+            <w:tcMar>
+              <w:top w:w="80" w:type="dxa"/>
+              <w:left w:w="120" w:type="dxa"/>
+              <w:bottom w:w="80" w:type="dxa"/>
+              <w:right w:w="120" w:type="dxa"/>
+            </w:tcMar>
+            <w:shd w:fill="F5F8FF"/>
+            <w:vAlign w:val="center"/>
+          </w:tcPr>
+          <w:p>
+            <w:pPr>
+              <w:spacing w:after="0"/>
+            </w:pPr>
+            <w:r>
+              <w:rPr>
+                <w:rFonts w:ascii="Wix Madefor Display" w:hAnsi="Wix Madefor Display" w:eastAsia="Wix Madefor Display"/>
+                <w:b w:val="0"/>
+                <w:color w:val="000000"/>
+                <w:sz w:val="16"/>
+              </w:rPr>
+              <w:t>Top-down layers, bottom-up buyer/spend build, TAM/SAM/SOM, CAGR checks.</w:t>
+            </w:r>
+          </w:p>
+        </w:tc>
+      </w:tr>
+      <w:tr>
+        <w:tc>
+          <w:tcPr>
+            <w:tcW w:type="dxa" w:w="3300"/>
+            <w:tcBorders>
+              <w:top w:val="single" w:sz="4" w:space="0" w:color="DDDDDD"/>
+              <w:left w:val="single" w:sz="4" w:space="0" w:color="DDDDDD"/>
+              <w:bottom w:val="single" w:sz="4" w:space="0" w:color="DDDDDD"/>
+              <w:right w:val="single" w:sz="4" w:space="0" w:color="DDDDDD"/>
+            </w:tcBorders>
+            <w:tcMar>
+              <w:top w:w="80" w:type="dxa"/>
+              <w:left w:w="120" w:type="dxa"/>
+              <w:bottom w:w="80" w:type="dxa"/>
+              <w:right w:w="120" w:type="dxa"/>
+            </w:tcMar>
+            <w:vAlign w:val="center"/>
+          </w:tcPr>
+          <w:p>
+            <w:pPr>
+              <w:spacing w:after="0"/>
+            </w:pPr>
+            <w:r>
+              <w:rPr>
+                <w:rFonts w:ascii="Wix Madefor Display" w:hAnsi="Wix Madefor Display" w:eastAsia="Wix Madefor Display"/>
+                <w:b w:val="0"/>
+                <w:color w:val="000000"/>
+                <w:sz w:val="16"/>
+              </w:rPr>
+              <w:t>Competitive landscape</w:t>
+            </w:r>
+          </w:p>
+        </w:tc>
+        <w:tc>
+          <w:tcPr>
+            <w:tcW w:type="dxa" w:w="7500"/>
+            <w:tcBorders>
+              <w:top w:val="single" w:sz="4" w:space="0" w:color="DDDDDD"/>
+              <w:left w:val="single" w:sz="4" w:space="0" w:color="DDDDDD"/>
+              <w:bottom w:val="single" w:sz="4" w:space="0" w:color="DDDDDD"/>
+              <w:right w:val="single" w:sz="4" w:space="0" w:color="DDDDDD"/>
+            </w:tcBorders>
+            <w:tcMar>
+              <w:top w:w="80" w:type="dxa"/>
+              <w:left w:w="120" w:type="dxa"/>
+              <w:bottom w:w="80" w:type="dxa"/>
+              <w:right w:w="120" w:type="dxa"/>
+            </w:tcMar>
+            <w:vAlign w:val="center"/>
+          </w:tcPr>
+          <w:p>
+            <w:pPr>
+              <w:spacing w:after="0"/>
+            </w:pPr>
+            <w:r>
+              <w:rPr>
+                <w:rFonts w:ascii="Wix Madefor Display" w:hAnsi="Wix Madefor Display" w:eastAsia="Wix Madefor Display"/>
+                <w:b w:val="0"/>
+                <w:color w:val="000000"/>
+                <w:sz w:val="16"/>
+              </w:rPr>
+              <w:t>Stack/control map, competitor profiles, threat matrix, white-space map.</w:t>
+            </w:r>
+          </w:p>
+        </w:tc>
+      </w:tr>
+      <w:tr>
+        <w:tc>
+          <w:tcPr>
+            <w:tcW w:type="dxa" w:w="3300"/>
+            <w:tcBorders>
+              <w:top w:val="single" w:sz="4" w:space="0" w:color="DDDDDD"/>
+              <w:left w:val="single" w:sz="4" w:space="0" w:color="DDDDDD"/>
+              <w:bottom w:val="single" w:sz="4" w:space="0" w:color="DDDDDD"/>
+              <w:right w:val="single" w:sz="4" w:space="0" w:color="DDDDDD"/>
+            </w:tcBorders>
+            <w:tcMar>
+              <w:top w:w="80" w:type="dxa"/>
+              <w:left w:w="120" w:type="dxa"/>
+              <w:bottom w:w="80" w:type="dxa"/>
+              <w:right w:w="120" w:type="dxa"/>
+            </w:tcMar>
+            <w:shd w:fill="F5F8FF"/>
+            <w:vAlign w:val="center"/>
+          </w:tcPr>
+          <w:p>
+            <w:pPr>
+              <w:spacing w:after="0"/>
+            </w:pPr>
+            <w:r>
+              <w:rPr>
+                <w:rFonts w:ascii="Wix Madefor Display" w:hAnsi="Wix Madefor Display" w:eastAsia="Wix Madefor Display"/>
+                <w:b w:val="0"/>
+                <w:color w:val="000000"/>
+                <w:sz w:val="16"/>
+              </w:rPr>
+              <w:t>Thesis stress-test</w:t>
+            </w:r>
+          </w:p>
+        </w:tc>
+        <w:tc>
+          <w:tcPr>
+            <w:tcW w:type="dxa" w:w="7500"/>
+            <w:tcBorders>
+              <w:top w:val="single" w:sz="4" w:space="0" w:color="DDDDDD"/>
+              <w:left w:val="single" w:sz="4" w:space="0" w:color="DDDDDD"/>
+              <w:bottom w:val="single" w:sz="4" w:space="0" w:color="DDDDDD"/>
+              <w:right w:val="single" w:sz="4" w:space="0" w:color="DDDDDD"/>
+            </w:tcBorders>
+            <w:tcMar>
+              <w:top w:w="80" w:type="dxa"/>
+              <w:left w:w="120" w:type="dxa"/>
+              <w:bottom w:w="80" w:type="dxa"/>
+              <w:right w:w="120" w:type="dxa"/>
+            </w:tcMar>
+            <w:shd w:fill="F5F8FF"/>
+            <w:vAlign w:val="center"/>
+          </w:tcPr>
+          <w:p>
+            <w:pPr>
+              <w:spacing w:after="0"/>
+            </w:pPr>
+            <w:r>
+              <w:rPr>
+                <w:rFonts w:ascii="Wix Madefor Display" w:hAnsi="Wix Madefor Display" w:eastAsia="Wix Madefor Display"/>
+                <w:b w:val="0"/>
+                <w:color w:val="000000"/>
+                <w:sz w:val="16"/>
+              </w:rPr>
+              <w:t>Validation, numbered holes, bottleneck ranking, alternative thesis, scorecard.</w:t>
+            </w:r>
+          </w:p>
+        </w:tc>
+      </w:tr>
+      <w:tr>
+        <w:tc>
+          <w:tcPr>
+            <w:tcW w:type="dxa" w:w="3300"/>
+            <w:tcBorders>
+              <w:top w:val="single" w:sz="4" w:space="0" w:color="DDDDDD"/>
+              <w:left w:val="single" w:sz="4" w:space="0" w:color="DDDDDD"/>
+              <w:bottom w:val="single" w:sz="4" w:space="0" w:color="DDDDDD"/>
+              <w:right w:val="single" w:sz="4" w:space="0" w:color="DDDDDD"/>
+            </w:tcBorders>
+            <w:tcMar>
+              <w:top w:w="80" w:type="dxa"/>
+              <w:left w:w="120" w:type="dxa"/>
+              <w:bottom w:w="80" w:type="dxa"/>
+              <w:right w:w="120" w:type="dxa"/>
+            </w:tcMar>
+            <w:vAlign w:val="center"/>
+          </w:tcPr>
+          <w:p>
+            <w:pPr>
+              <w:spacing w:after="0"/>
+            </w:pPr>
+            <w:r>
+              <w:rPr>
+                <w:rFonts w:ascii="Wix Madefor Display" w:hAnsi="Wix Madefor Display" w:eastAsia="Wix Madefor Display"/>
+                <w:b w:val="0"/>
+                <w:color w:val="000000"/>
+                <w:sz w:val="16"/>
+              </w:rPr>
+              <w:t>Trends and timing</w:t>
+            </w:r>
+          </w:p>
+        </w:tc>
+        <w:tc>
+          <w:tcPr>
+            <w:tcW w:type="dxa" w:w="7500"/>
+            <w:tcBorders>
+              <w:top w:val="single" w:sz="4" w:space="0" w:color="DDDDDD"/>
+              <w:left w:val="single" w:sz="4" w:space="0" w:color="DDDDDD"/>
+              <w:bottom w:val="single" w:sz="4" w:space="0" w:color="DDDDDD"/>
+              <w:right w:val="single" w:sz="4" w:space="0" w:color="DDDDDD"/>
+            </w:tcBorders>
+            <w:tcMar>
+              <w:top w:w="80" w:type="dxa"/>
+              <w:left w:w="120" w:type="dxa"/>
+              <w:bottom w:w="80" w:type="dxa"/>
+              <w:right w:w="120" w:type="dxa"/>
+            </w:tcMar>
+            <w:vAlign w:val="center"/>
+          </w:tcPr>
+          <w:p>
+            <w:pPr>
+              <w:spacing w:after="0"/>
+            </w:pPr>
+            <w:r>
+              <w:rPr>
+                <w:rFonts w:ascii="Wix Madefor Display" w:hAnsi="Wix Madefor Display" w:eastAsia="Wix Madefor Display"/>
+                <w:b w:val="0"/>
+                <w:color w:val="000000"/>
+                <w:sz w:val="16"/>
+              </w:rPr>
+              <w:t>Macro/micro trends, disruption stack, bottleneck cascade, adoption timeline.</w:t>
+            </w:r>
+          </w:p>
+        </w:tc>
+      </w:tr>
+      <w:tr>
+        <w:tc>
+          <w:tcPr>
+            <w:tcW w:type="dxa" w:w="3300"/>
+            <w:tcBorders>
+              <w:top w:val="single" w:sz="4" w:space="0" w:color="DDDDDD"/>
+              <w:left w:val="single" w:sz="4" w:space="0" w:color="DDDDDD"/>
+              <w:bottom w:val="single" w:sz="4" w:space="0" w:color="DDDDDD"/>
+              <w:right w:val="single" w:sz="4" w:space="0" w:color="DDDDDD"/>
+            </w:tcBorders>
+            <w:tcMar>
+              <w:top w:w="80" w:type="dxa"/>
+              <w:left w:w="120" w:type="dxa"/>
+              <w:bottom w:w="80" w:type="dxa"/>
+              <w:right w:w="120" w:type="dxa"/>
+            </w:tcMar>
+            <w:shd w:fill="F5F8FF"/>
+            <w:vAlign w:val="center"/>
+          </w:tcPr>
+          <w:p>
+            <w:pPr>
+              <w:spacing w:after="0"/>
+            </w:pPr>
+            <w:r>
+              <w:rPr>
+                <w:rFonts w:ascii="Wix Madefor Display" w:hAnsi="Wix Madefor Display" w:eastAsia="Wix Madefor Display"/>
+                <w:b w:val="0"/>
+                <w:color w:val="000000"/>
+                <w:sz w:val="16"/>
+              </w:rPr>
+              <w:t>SWOT and Porter's</w:t>
+            </w:r>
+          </w:p>
+        </w:tc>
+        <w:tc>
+          <w:tcPr>
+            <w:tcW w:type="dxa" w:w="7500"/>
+            <w:tcBorders>
+              <w:top w:val="single" w:sz="4" w:space="0" w:color="DDDDDD"/>
+              <w:left w:val="single" w:sz="4" w:space="0" w:color="DDDDDD"/>
+              <w:bottom w:val="single" w:sz="4" w:space="0" w:color="DDDDDD"/>
+              <w:right w:val="single" w:sz="4" w:space="0" w:color="DDDDDD"/>
+            </w:tcBorders>
+            <w:tcMar>
+              <w:top w:w="80" w:type="dxa"/>
+              <w:left w:w="120" w:type="dxa"/>
+              <w:bottom w:w="80" w:type="dxa"/>
+              <w:right w:w="120" w:type="dxa"/>
+            </w:tcMar>
+            <w:shd w:fill="F5F8FF"/>
+            <w:vAlign w:val="center"/>
+          </w:tcPr>
+          <w:p>
+            <w:pPr>
+              <w:spacing w:after="0"/>
+            </w:pPr>
+            <w:r>
+              <w:rPr>
+                <w:rFonts w:ascii="Wix Madefor Display" w:hAnsi="Wix Madefor Display" w:eastAsia="Wix Madefor Display"/>
+                <w:b w:val="0"/>
+                <w:color w:val="000000"/>
+                <w:sz w:val="16"/>
+              </w:rPr>
+              <w:t>SWOT cross-analysis, Five Forces ratings, integrated implication.</w:t>
+            </w:r>
+          </w:p>
+        </w:tc>
+      </w:tr>
+      <w:tr>
+        <w:tc>
+          <w:tcPr>
+            <w:tcW w:type="dxa" w:w="3300"/>
+            <w:tcBorders>
+              <w:top w:val="single" w:sz="4" w:space="0" w:color="DDDDDD"/>
+              <w:left w:val="single" w:sz="4" w:space="0" w:color="DDDDDD"/>
+              <w:bottom w:val="single" w:sz="4" w:space="0" w:color="DDDDDD"/>
+              <w:right w:val="single" w:sz="4" w:space="0" w:color="DDDDDD"/>
+            </w:tcBorders>
+            <w:tcMar>
+              <w:top w:w="80" w:type="dxa"/>
+              <w:left w:w="120" w:type="dxa"/>
+              <w:bottom w:w="80" w:type="dxa"/>
+              <w:right w:w="120" w:type="dxa"/>
+            </w:tcMar>
+            <w:vAlign w:val="center"/>
+          </w:tcPr>
+          <w:p>
+            <w:pPr>
+              <w:spacing w:after="0"/>
+            </w:pPr>
+            <w:r>
+              <w:rPr>
+                <w:rFonts w:ascii="Wix Madefor Display" w:hAnsi="Wix Madefor Display" w:eastAsia="Wix Madefor Display"/>
+                <w:b w:val="0"/>
+                <w:color w:val="000000"/>
+                <w:sz w:val="16"/>
+              </w:rPr>
+              <w:t>GTM strategy</w:t>
+            </w:r>
+          </w:p>
+        </w:tc>
+        <w:tc>
+          <w:tcPr>
+            <w:tcW w:type="dxa" w:w="7500"/>
+            <w:tcBorders>
+              <w:top w:val="single" w:sz="4" w:space="0" w:color="DDDDDD"/>
+              <w:left w:val="single" w:sz="4" w:space="0" w:color="DDDDDD"/>
+              <w:bottom w:val="single" w:sz="4" w:space="0" w:color="DDDDDD"/>
+              <w:right w:val="single" w:sz="4" w:space="0" w:color="DDDDDD"/>
+            </w:tcBorders>
+            <w:tcMar>
+              <w:top w:w="80" w:type="dxa"/>
+              <w:left w:w="120" w:type="dxa"/>
+              <w:bottom w:w="80" w:type="dxa"/>
+              <w:right w:w="120" w:type="dxa"/>
+            </w:tcMar>
+            <w:vAlign w:val="center"/>
+          </w:tcPr>
+          <w:p>
+            <w:pPr>
+              <w:spacing w:after="0"/>
+            </w:pPr>
+            <w:r>
+              <w:rPr>
+                <w:rFonts w:ascii="Wix Madefor Display" w:hAnsi="Wix Madefor Display" w:eastAsia="Wix Madefor Display"/>
+                <w:b w:val="0"/>
+                <w:color w:val="000000"/>
+                <w:sz w:val="16"/>
+              </w:rPr>
+              <w:t>ICP, positioning, launch phasing, channels, partnerships, revenue model.</w:t>
+            </w:r>
+          </w:p>
+        </w:tc>
+      </w:tr>
+      <w:tr>
+        <w:tc>
+          <w:tcPr>
+            <w:tcW w:type="dxa" w:w="3300"/>
+            <w:tcBorders>
+              <w:top w:val="single" w:sz="4" w:space="0" w:color="DDDDDD"/>
+              <w:left w:val="single" w:sz="4" w:space="0" w:color="DDDDDD"/>
+              <w:bottom w:val="single" w:sz="4" w:space="0" w:color="DDDDDD"/>
+              <w:right w:val="single" w:sz="4" w:space="0" w:color="DDDDDD"/>
+            </w:tcBorders>
+            <w:tcMar>
+              <w:top w:w="80" w:type="dxa"/>
+              <w:left w:w="120" w:type="dxa"/>
+              <w:bottom w:w="80" w:type="dxa"/>
+              <w:right w:w="120" w:type="dxa"/>
+            </w:tcMar>
+            <w:shd w:fill="F5F8FF"/>
+            <w:vAlign w:val="center"/>
+          </w:tcPr>
+          <w:p>
+            <w:pPr>
+              <w:spacing w:after="0"/>
+            </w:pPr>
+            <w:r>
+              <w:rPr>
+                <w:rFonts w:ascii="Wix Madefor Display" w:hAnsi="Wix Madefor Display" w:eastAsia="Wix Madefor Display"/>
+                <w:b w:val="0"/>
+                <w:color w:val="000000"/>
+                <w:sz w:val="16"/>
+              </w:rPr>
+              <w:t>Financial and unit economics</w:t>
+            </w:r>
+          </w:p>
+        </w:tc>
+        <w:tc>
+          <w:tcPr>
+            <w:tcW w:type="dxa" w:w="7500"/>
+            <w:tcBorders>
+              <w:top w:val="single" w:sz="4" w:space="0" w:color="DDDDDD"/>
+              <w:left w:val="single" w:sz="4" w:space="0" w:color="DDDDDD"/>
+              <w:bottom w:val="single" w:sz="4" w:space="0" w:color="DDDDDD"/>
+              <w:right w:val="single" w:sz="4" w:space="0" w:color="DDDDDD"/>
+            </w:tcBorders>
+            <w:tcMar>
+              <w:top w:w="80" w:type="dxa"/>
+              <w:left w:w="120" w:type="dxa"/>
+              <w:bottom w:w="80" w:type="dxa"/>
+              <w:right w:w="120" w:type="dxa"/>
+            </w:tcMar>
+            <w:shd w:fill="F5F8FF"/>
+            <w:vAlign w:val="center"/>
+          </w:tcPr>
+          <w:p>
+            <w:pPr>
+              <w:spacing w:after="0"/>
+            </w:pPr>
+            <w:r>
+              <w:rPr>
+                <w:rFonts w:ascii="Wix Madefor Display" w:hAnsi="Wix Madefor Display" w:eastAsia="Wix Madefor Display"/>
+                <w:b w:val="0"/>
+                <w:color w:val="000000"/>
+                <w:sz w:val="16"/>
+              </w:rPr>
+              <w:t>Unit economics, three-year model, sensitivity, build/buy/partner, payback.</w:t>
+            </w:r>
+          </w:p>
+        </w:tc>
+      </w:tr>
+      <w:tr>
+        <w:tc>
+          <w:tcPr>
+            <w:tcW w:type="dxa" w:w="3300"/>
+            <w:tcBorders>
+              <w:top w:val="single" w:sz="4" w:space="0" w:color="DDDDDD"/>
+              <w:left w:val="single" w:sz="4" w:space="0" w:color="DDDDDD"/>
+              <w:bottom w:val="single" w:sz="4" w:space="0" w:color="DDDDDD"/>
+              <w:right w:val="single" w:sz="4" w:space="0" w:color="DDDDDD"/>
+            </w:tcBorders>
+            <w:tcMar>
+              <w:top w:w="80" w:type="dxa"/>
+              <w:left w:w="120" w:type="dxa"/>
+              <w:bottom w:w="80" w:type="dxa"/>
+              <w:right w:w="120" w:type="dxa"/>
+            </w:tcMar>
+            <w:vAlign w:val="center"/>
+          </w:tcPr>
+          <w:p>
+            <w:pPr>
+              <w:spacing w:after="0"/>
+            </w:pPr>
+            <w:r>
+              <w:rPr>
+                <w:rFonts w:ascii="Wix Madefor Display" w:hAnsi="Wix Madefor Display" w:eastAsia="Wix Madefor Display"/>
+                <w:b w:val="0"/>
+                <w:color w:val="000000"/>
+                <w:sz w:val="16"/>
+              </w:rPr>
+              <w:t>Risk and scenarios</w:t>
+            </w:r>
+          </w:p>
+        </w:tc>
+        <w:tc>
+          <w:tcPr>
+            <w:tcW w:type="dxa" w:w="7500"/>
+            <w:tcBorders>
+              <w:top w:val="single" w:sz="4" w:space="0" w:color="DDDDDD"/>
+              <w:left w:val="single" w:sz="4" w:space="0" w:color="DDDDDD"/>
+              <w:bottom w:val="single" w:sz="4" w:space="0" w:color="DDDDDD"/>
+              <w:right w:val="single" w:sz="4" w:space="0" w:color="DDDDDD"/>
+            </w:tcBorders>
+            <w:tcMar>
+              <w:top w:w="80" w:type="dxa"/>
+              <w:left w:w="120" w:type="dxa"/>
+              <w:bottom w:w="80" w:type="dxa"/>
+              <w:right w:w="120" w:type="dxa"/>
+            </w:tcMar>
+            <w:vAlign w:val="center"/>
+          </w:tcPr>
+          <w:p>
+            <w:pPr>
+              <w:spacing w:after="0"/>
+            </w:pPr>
+            <w:r>
+              <w:rPr>
+                <w:rFonts w:ascii="Wix Madefor Display" w:hAnsi="Wix Madefor Display" w:eastAsia="Wix Madefor Display"/>
+                <w:b w:val="0"/>
+                <w:color w:val="000000"/>
+                <w:sz w:val="16"/>
+              </w:rPr>
+              <w:t>Risk register, heatmap, scenarios, risk-weighted actions.</w:t>
+            </w:r>
+          </w:p>
+        </w:tc>
+      </w:tr>
+      <w:tr>
+        <w:tc>
+          <w:tcPr>
+            <w:tcW w:type="dxa" w:w="3300"/>
+            <w:tcBorders>
+              <w:top w:val="single" w:sz="4" w:space="0" w:color="DDDDDD"/>
+              <w:left w:val="single" w:sz="4" w:space="0" w:color="DDDDDD"/>
+              <w:bottom w:val="single" w:sz="4" w:space="0" w:color="DDDDDD"/>
+              <w:right w:val="single" w:sz="4" w:space="0" w:color="DDDDDD"/>
+            </w:tcBorders>
+            <w:tcMar>
+              <w:top w:w="80" w:type="dxa"/>
+              <w:left w:w="120" w:type="dxa"/>
+              <w:bottom w:w="80" w:type="dxa"/>
+              <w:right w:w="120" w:type="dxa"/>
+            </w:tcMar>
+            <w:shd w:fill="F5F8FF"/>
+            <w:vAlign w:val="center"/>
+          </w:tcPr>
+          <w:p>
+            <w:pPr>
+              <w:spacing w:after="0"/>
+            </w:pPr>
+            <w:r>
+              <w:rPr>
+                <w:rFonts w:ascii="Wix Madefor Display" w:hAnsi="Wix Madefor Display" w:eastAsia="Wix Madefor Display"/>
+                <w:b w:val="0"/>
+                <w:color w:val="000000"/>
+                <w:sz w:val="16"/>
+              </w:rPr>
+              <w:t>Market entry</w:t>
+            </w:r>
+          </w:p>
+        </w:tc>
+        <w:tc>
+          <w:tcPr>
+            <w:tcW w:type="dxa" w:w="7500"/>
+            <w:tcBorders>
+              <w:top w:val="single" w:sz="4" w:space="0" w:color="DDDDDD"/>
+              <w:left w:val="single" w:sz="4" w:space="0" w:color="DDDDDD"/>
+              <w:bottom w:val="single" w:sz="4" w:space="0" w:color="DDDDDD"/>
+              <w:right w:val="single" w:sz="4" w:space="0" w:color="DDDDDD"/>
+            </w:tcBorders>
+            <w:tcMar>
+              <w:top w:w="80" w:type="dxa"/>
+              <w:left w:w="120" w:type="dxa"/>
+              <w:bottom w:w="80" w:type="dxa"/>
+              <w:right w:w="120" w:type="dxa"/>
+            </w:tcMar>
+            <w:shd w:fill="F5F8FF"/>
+            <w:vAlign w:val="center"/>
+          </w:tcPr>
+          <w:p>
+            <w:pPr>
+              <w:spacing w:after="0"/>
+            </w:pPr>
+            <w:r>
+              <w:rPr>
+                <w:rFonts w:ascii="Wix Madefor Display" w:hAnsi="Wix Madefor Display" w:eastAsia="Wix Madefor Display"/>
+                <w:b w:val="0"/>
+                <w:color w:val="000000"/>
+                <w:sz w:val="16"/>
+              </w:rPr>
+              <w:t>Market attractiveness score, entry mode comparison, roadmap, investment plan.</w:t>
+            </w:r>
+          </w:p>
+        </w:tc>
+      </w:tr>
+      <w:tr>
+        <w:tc>
+          <w:tcPr>
+            <w:tcW w:type="dxa" w:w="3300"/>
+            <w:tcBorders>
+              <w:top w:val="single" w:sz="4" w:space="0" w:color="DDDDDD"/>
+              <w:left w:val="single" w:sz="4" w:space="0" w:color="DDDDDD"/>
+              <w:bottom w:val="single" w:sz="4" w:space="0" w:color="DDDDDD"/>
+              <w:right w:val="single" w:sz="4" w:space="0" w:color="DDDDDD"/>
+            </w:tcBorders>
+            <w:tcMar>
+              <w:top w:w="80" w:type="dxa"/>
+              <w:left w:w="120" w:type="dxa"/>
+              <w:bottom w:w="80" w:type="dxa"/>
+              <w:right w:w="120" w:type="dxa"/>
+            </w:tcMar>
+            <w:vAlign w:val="center"/>
+          </w:tcPr>
+          <w:p>
+            <w:pPr>
+              <w:spacing w:after="0"/>
+            </w:pPr>
+            <w:r>
+              <w:rPr>
+                <w:rFonts w:ascii="Wix Madefor Display" w:hAnsi="Wix Madefor Display" w:eastAsia="Wix Madefor Display"/>
+                <w:b w:val="0"/>
+                <w:color w:val="000000"/>
+                <w:sz w:val="16"/>
+              </w:rPr>
+              <w:t>Executive synthesis</w:t>
+            </w:r>
+          </w:p>
+        </w:tc>
+        <w:tc>
+          <w:tcPr>
+            <w:tcW w:type="dxa" w:w="7500"/>
+            <w:tcBorders>
+              <w:top w:val="single" w:sz="4" w:space="0" w:color="DDDDDD"/>
+              <w:left w:val="single" w:sz="4" w:space="0" w:color="DDDDDD"/>
+              <w:bottom w:val="single" w:sz="4" w:space="0" w:color="DDDDDD"/>
+              <w:right w:val="single" w:sz="4" w:space="0" w:color="DDDDDD"/>
+            </w:tcBorders>
+            <w:tcMar>
+              <w:top w:w="80" w:type="dxa"/>
+              <w:left w:w="120" w:type="dxa"/>
+              <w:bottom w:w="80" w:type="dxa"/>
+              <w:right w:w="120" w:type="dxa"/>
+            </w:tcMar>
+            <w:vAlign w:val="center"/>
+          </w:tcPr>
+          <w:p>
+            <w:pPr>
+              <w:spacing w:after="0"/>
+            </w:pPr>
+            <w:r>
+              <w:rPr>
+                <w:rFonts w:ascii="Wix Madefor Display" w:hAnsi="Wix Madefor Display" w:eastAsia="Wix Madefor Display"/>
+                <w:b w:val="0"/>
+                <w:color w:val="000000"/>
+                <w:sz w:val="16"/>
+              </w:rPr>
+              <w:t>CEO brief, strategic options, recommendation, 90-day actions, final scorecard.</w:t>
+            </w:r>
+          </w:p>
+        </w:tc>
+      </w:tr>
+    </w:tbl>
+    <w:p/>
+    <w:p>
+      <w:pPr>
+        <w:keepNext/>
+        <w:spacing w:before="200" w:after="100"/>
+      </w:pPr>
+      <w:r>
+        <w:rPr>
+          <w:rFonts w:ascii="Wix Madefor Display SemiBold" w:hAnsi="Wix Madefor Display SemiBold" w:eastAsia="Wix Madefor Display SemiBold"/>
+          <w:b/>
+          <w:color w:val="4280F4"/>
+          <w:sz w:val="24"/>
+        </w:rPr>
         <w:t>Workflow</w:t>
       </w:r>
     </w:p>
@@ -1851,7 +2630,7 @@
           <w:rFonts w:ascii="Wix Madefor Display" w:hAnsi="Wix Madefor Display" w:eastAsia="Wix Madefor Display"/>
           <w:sz w:val="18"/>
         </w:rPr>
-        <w:t>Label Pattern-built estimates separately from third-party market figures.</w:t>
+        <w:t>Label internal/client-built estimates separately from third-party market figures.</w:t>
       </w:r>
     </w:p>
     <w:p>
@@ -2435,7 +3214,7 @@
                 <w:color w:val="000000"/>
                 <w:sz w:val="16"/>
               </w:rPr>
-              <w:t>Pattern analytic</w:t>
+              <w:t>Internal/client analytic</w:t>
             </w:r>
           </w:p>
         </w:tc>
@@ -2468,7 +3247,7 @@
                 <w:color w:val="000000"/>
                 <w:sz w:val="16"/>
               </w:rPr>
-              <w:t>Internal model, bridge, or scenario.</w:t>
+              <w:t>Internal model, bridge, scenario, or author-built estimate.</w:t>
             </w:r>
           </w:p>
         </w:tc>
@@ -2501,7 +3280,7 @@
                 <w:color w:val="000000"/>
                 <w:sz w:val="16"/>
               </w:rPr>
-              <w:t>Keep separate from consensus.</w:t>
+              <w:t>Keep separate from consensus and show assumptions.</w:t>
             </w:r>
           </w:p>
         </w:tc>

</xml_diff>